<commit_message>
Versão Mesclada do Documento
 Este arquivo é composto pela união do trabalho de cada membro desta equipe, que agora, chegou a sua versão definitiva.
</commit_message>
<xml_diff>
--- a/Hardware e Software.docx
+++ b/Hardware e Software.docx
@@ -5,8 +5,8 @@
     <w:tbl>
       <w:tblPr>
         <w:tblStyle w:val="SimplesTabela1"/>
+        <w:tblpPr w:leftFromText="141" w:rightFromText="141" w:vertAnchor="page" w:horzAnchor="margin" w:tblpXSpec="center" w:tblpY="1171"/>
         <w:tblW w:w="9339" w:type="dxa"/>
-        <w:jc w:val="center"/>
         <w:tblLook w:val="04A0" w:firstRow="1" w:lastRow="0" w:firstColumn="1" w:lastColumn="0" w:noHBand="0" w:noVBand="1"/>
       </w:tblPr>
       <w:tblGrid>
@@ -20,7 +20,6 @@
         <w:trPr>
           <w:cnfStyle w:val="100000000000" w:firstRow="1" w:lastRow="0" w:firstColumn="0" w:lastColumn="0" w:oddVBand="0" w:evenVBand="0" w:oddHBand="0" w:evenHBand="0" w:firstRowFirstColumn="0" w:firstRowLastColumn="0" w:lastRowFirstColumn="0" w:lastRowLastColumn="0"/>
           <w:trHeight w:val="488"/>
-          <w:jc w:val="center"/>
         </w:trPr>
         <w:tc>
           <w:tcPr>
@@ -90,7 +89,6 @@
         <w:trPr>
           <w:cnfStyle w:val="000000100000" w:firstRow="0" w:lastRow="0" w:firstColumn="0" w:lastColumn="0" w:oddVBand="0" w:evenVBand="0" w:oddHBand="1" w:evenHBand="0" w:firstRowFirstColumn="0" w:firstRowLastColumn="0" w:lastRowFirstColumn="0" w:lastRowLastColumn="0"/>
           <w:trHeight w:val="513"/>
-          <w:jc w:val="center"/>
         </w:trPr>
         <w:tc>
           <w:tcPr>
@@ -185,7 +183,6 @@
       <w:tr>
         <w:trPr>
           <w:trHeight w:val="488"/>
-          <w:jc w:val="center"/>
         </w:trPr>
         <w:tc>
           <w:tcPr>
@@ -257,7 +254,6 @@
         <w:trPr>
           <w:cnfStyle w:val="000000100000" w:firstRow="0" w:lastRow="0" w:firstColumn="0" w:lastColumn="0" w:oddVBand="0" w:evenVBand="0" w:oddHBand="1" w:evenHBand="0" w:firstRowFirstColumn="0" w:firstRowLastColumn="0" w:lastRowFirstColumn="0" w:lastRowLastColumn="0"/>
           <w:trHeight w:val="488"/>
-          <w:jc w:val="center"/>
         </w:trPr>
         <w:tc>
           <w:tcPr>
@@ -336,7 +332,6 @@
       <w:tr>
         <w:trPr>
           <w:trHeight w:val="488"/>
-          <w:jc w:val="center"/>
         </w:trPr>
         <w:tc>
           <w:tcPr>
@@ -423,7 +418,6 @@
         <w:trPr>
           <w:cnfStyle w:val="000000100000" w:firstRow="0" w:lastRow="0" w:firstColumn="0" w:lastColumn="0" w:oddVBand="0" w:evenVBand="0" w:oddHBand="1" w:evenHBand="0" w:firstRowFirstColumn="0" w:firstRowLastColumn="0" w:lastRowFirstColumn="0" w:lastRowLastColumn="0"/>
           <w:trHeight w:val="488"/>
-          <w:jc w:val="center"/>
         </w:trPr>
         <w:tc>
           <w:tcPr>
@@ -494,7 +488,6 @@
       <w:tr>
         <w:trPr>
           <w:trHeight w:val="488"/>
-          <w:jc w:val="center"/>
         </w:trPr>
         <w:tc>
           <w:tcPr>
@@ -579,7 +572,6 @@
         <w:trPr>
           <w:cnfStyle w:val="000000100000" w:firstRow="0" w:lastRow="0" w:firstColumn="0" w:lastColumn="0" w:oddVBand="0" w:evenVBand="0" w:oddHBand="1" w:evenHBand="0" w:firstRowFirstColumn="0" w:firstRowLastColumn="0" w:lastRowFirstColumn="0" w:lastRowLastColumn="0"/>
           <w:trHeight w:val="488"/>
-          <w:jc w:val="center"/>
         </w:trPr>
         <w:tc>
           <w:tcPr>
@@ -657,7 +649,6 @@
       <w:tr>
         <w:trPr>
           <w:trHeight w:val="488"/>
-          <w:jc w:val="center"/>
         </w:trPr>
         <w:tc>
           <w:tcPr>
@@ -731,7 +722,6 @@
         <w:trPr>
           <w:cnfStyle w:val="000000100000" w:firstRow="0" w:lastRow="0" w:firstColumn="0" w:lastColumn="0" w:oddVBand="0" w:evenVBand="0" w:oddHBand="1" w:evenHBand="0" w:firstRowFirstColumn="0" w:firstRowLastColumn="0" w:lastRowFirstColumn="0" w:lastRowLastColumn="0"/>
           <w:trHeight w:val="488"/>
-          <w:jc w:val="center"/>
         </w:trPr>
         <w:tc>
           <w:tcPr>
@@ -836,7 +826,6 @@
       <w:tr>
         <w:trPr>
           <w:trHeight w:val="488"/>
-          <w:jc w:val="center"/>
         </w:trPr>
         <w:tc>
           <w:tcPr>
@@ -920,7 +909,6 @@
         <w:trPr>
           <w:cnfStyle w:val="000000100000" w:firstRow="0" w:lastRow="0" w:firstColumn="0" w:lastColumn="0" w:oddVBand="0" w:evenVBand="0" w:oddHBand="1" w:evenHBand="0" w:firstRowFirstColumn="0" w:firstRowLastColumn="0" w:lastRowFirstColumn="0" w:lastRowLastColumn="0"/>
           <w:trHeight w:val="488"/>
-          <w:jc w:val="center"/>
         </w:trPr>
         <w:tc>
           <w:tcPr>
@@ -989,7 +977,1602 @@
         </w:tc>
       </w:tr>
     </w:tbl>
+    <w:p>
+      <w:pPr>
+        <w:rPr>
+          <w:rFonts w:ascii="Adobe Hebrew" w:hAnsi="Adobe Hebrew" w:cs="Adobe Hebrew"/>
+          <w:sz w:val="30"/>
+          <w:szCs w:val="30"/>
+        </w:rPr>
+      </w:pPr>
+      <w:r>
+        <w:br/>
+      </w:r>
+      <w:r>
+        <w:br/>
+      </w:r>
+      <w:r>
+        <w:br/>
+      </w:r>
+      <w:r>
+        <w:br/>
+      </w:r>
+      <w:r>
+        <w:rPr>
+          <w:rFonts w:ascii="Adobe Hebrew" w:hAnsi="Adobe Hebrew" w:cs="Adobe Hebrew"/>
+          <w:sz w:val="30"/>
+          <w:szCs w:val="30"/>
+        </w:rPr>
+        <w:t xml:space="preserve"> - </w:t>
+      </w:r>
+      <w:r>
+        <w:rPr>
+          <w:rFonts w:ascii="Adobe Hebrew" w:hAnsi="Adobe Hebrew" w:cs="Adobe Hebrew"/>
+          <w:sz w:val="30"/>
+          <w:szCs w:val="30"/>
+        </w:rPr>
+        <w:t>CONFIGURAÇÕES</w:t>
+      </w:r>
+      <w:r>
+        <w:rPr>
+          <w:rFonts w:ascii="Adobe Hebrew" w:hAnsi="Adobe Hebrew" w:cs="Adobe Hebrew"/>
+          <w:sz w:val="30"/>
+          <w:szCs w:val="30"/>
+        </w:rPr>
+        <w:t xml:space="preserve"> -</w:t>
+      </w:r>
+      <w:r>
+        <w:rPr>
+          <w:rFonts w:ascii="Adobe Hebrew" w:hAnsi="Adobe Hebrew" w:cs="Adobe Hebrew"/>
+          <w:sz w:val="30"/>
+          <w:szCs w:val="30"/>
+        </w:rPr>
+        <w:br/>
+      </w:r>
+      <w:r>
+        <w:rPr>
+          <w:rFonts w:ascii="Adobe Hebrew" w:hAnsi="Adobe Hebrew" w:cs="Adobe Hebrew"/>
+          <w:sz w:val="30"/>
+          <w:szCs w:val="30"/>
+        </w:rPr>
+        <w:br/>
+      </w:r>
+    </w:p>
+    <w:p>
+      <w:pPr>
+        <w:rPr>
+          <w:rFonts w:ascii="Adobe Hebrew" w:hAnsi="Adobe Hebrew" w:cs="Adobe Hebrew"/>
+        </w:rPr>
+      </w:pPr>
+      <w:r>
+        <w:rPr>
+          <w:rFonts w:ascii="Adobe Hebrew" w:hAnsi="Adobe Hebrew" w:cs="Adobe Hebrew"/>
+        </w:rPr>
+        <w:t>CONFIGURAÇÃO DA BIOS</w:t>
+      </w:r>
+    </w:p>
+    <w:p>
+      <w:pPr>
+        <w:rPr>
+          <w:rFonts w:ascii="Adobe Arabic" w:hAnsi="Adobe Arabic" w:cs="Adobe Arabic"/>
+          <w:sz w:val="36"/>
+          <w:szCs w:val="36"/>
+        </w:rPr>
+      </w:pPr>
+      <w:r>
+        <w:rPr>
+          <w:rFonts w:ascii="Adobe Arabic" w:hAnsi="Adobe Arabic" w:cs="Adobe Arabic"/>
+          <w:sz w:val="36"/>
+          <w:szCs w:val="36"/>
+        </w:rPr>
+        <w:t>Ativar:</w:t>
+      </w:r>
+    </w:p>
+    <w:p>
+      <w:pPr>
+        <w:rPr>
+          <w:rFonts w:ascii="Adobe Arabic" w:hAnsi="Adobe Arabic" w:cs="Adobe Arabic"/>
+        </w:rPr>
+      </w:pPr>
+      <w:r>
+        <w:t>• EXPO</w:t>
+      </w:r>
+    </w:p>
+    <w:p>
+      <w:r>
+        <w:t xml:space="preserve">• </w:t>
+      </w:r>
+      <w:proofErr w:type="spellStart"/>
+      <w:r>
+        <w:t>Precision</w:t>
+      </w:r>
+      <w:proofErr w:type="spellEnd"/>
+      <w:r>
+        <w:t xml:space="preserve"> </w:t>
+      </w:r>
+      <w:proofErr w:type="spellStart"/>
+      <w:r>
+        <w:t>Boost</w:t>
+      </w:r>
+      <w:proofErr w:type="spellEnd"/>
+      <w:r>
+        <w:t xml:space="preserve"> Overdrive (PBO)</w:t>
+      </w:r>
+    </w:p>
+    <w:p>
+      <w:r>
+        <w:t xml:space="preserve">• Above 4G </w:t>
+      </w:r>
+      <w:proofErr w:type="spellStart"/>
+      <w:r>
+        <w:t>Decoding</w:t>
+      </w:r>
+      <w:proofErr w:type="spellEnd"/>
+    </w:p>
+    <w:p>
+      <w:r>
+        <w:t xml:space="preserve">• </w:t>
+      </w:r>
+      <w:proofErr w:type="spellStart"/>
+      <w:r>
+        <w:t>Resizable</w:t>
+      </w:r>
+      <w:proofErr w:type="spellEnd"/>
+      <w:r>
+        <w:t xml:space="preserve"> BAR</w:t>
+      </w:r>
+      <w:r>
+        <w:br/>
+      </w:r>
+    </w:p>
+    <w:p>
+      <w:pPr>
+        <w:rPr>
+          <w:rFonts w:ascii="Adobe Arabic" w:hAnsi="Adobe Arabic" w:cs="Adobe Arabic"/>
+          <w:sz w:val="36"/>
+          <w:szCs w:val="36"/>
+        </w:rPr>
+      </w:pPr>
+      <w:r>
+        <w:rPr>
+          <w:rFonts w:ascii="Adobe Arabic" w:hAnsi="Adobe Arabic" w:cs="Adobe Arabic"/>
+          <w:sz w:val="36"/>
+          <w:szCs w:val="36"/>
+        </w:rPr>
+        <w:t xml:space="preserve">Curve </w:t>
+      </w:r>
+      <w:proofErr w:type="spellStart"/>
+      <w:r>
+        <w:rPr>
+          <w:rFonts w:ascii="Adobe Arabic" w:hAnsi="Adobe Arabic" w:cs="Adobe Arabic"/>
+          <w:sz w:val="36"/>
+          <w:szCs w:val="36"/>
+        </w:rPr>
+        <w:t>Optimizer</w:t>
+      </w:r>
+      <w:proofErr w:type="spellEnd"/>
+      <w:r>
+        <w:rPr>
+          <w:rFonts w:ascii="Adobe Arabic" w:hAnsi="Adobe Arabic" w:cs="Adobe Arabic"/>
+          <w:sz w:val="36"/>
+          <w:szCs w:val="36"/>
+        </w:rPr>
+        <w:t>:</w:t>
+      </w:r>
+    </w:p>
+    <w:p>
+      <w:r>
+        <w:t>• Negative</w:t>
+      </w:r>
+    </w:p>
+    <w:p>
+      <w:r>
+        <w:lastRenderedPageBreak/>
+        <w:t xml:space="preserve">• -15 ou -20 </w:t>
+      </w:r>
+      <w:proofErr w:type="spellStart"/>
+      <w:r>
+        <w:t>all</w:t>
+      </w:r>
+      <w:proofErr w:type="spellEnd"/>
+      <w:r>
+        <w:t xml:space="preserve"> cores</w:t>
+      </w:r>
+    </w:p>
     <w:p/>
+    <w:p>
+      <w:pPr>
+        <w:rPr>
+          <w:rFonts w:ascii="Adobe Arabic" w:hAnsi="Adobe Arabic" w:cs="Adobe Arabic"/>
+          <w:sz w:val="36"/>
+          <w:szCs w:val="36"/>
+        </w:rPr>
+      </w:pPr>
+      <w:r>
+        <w:rPr>
+          <w:rFonts w:ascii="Adobe Arabic" w:hAnsi="Adobe Arabic" w:cs="Adobe Arabic"/>
+          <w:sz w:val="36"/>
+          <w:szCs w:val="36"/>
+        </w:rPr>
+        <w:t>Isso reduz:</w:t>
+      </w:r>
+    </w:p>
+    <w:p>
+      <w:r>
+        <w:t>• temperatura</w:t>
+      </w:r>
+    </w:p>
+    <w:p>
+      <w:r>
+        <w:t>• consumo</w:t>
+      </w:r>
+    </w:p>
+    <w:p>
+      <w:r>
+        <w:t>• ruído</w:t>
+      </w:r>
+    </w:p>
+    <w:p>
+      <w:pPr>
+        <w:rPr>
+          <w:rFonts w:ascii="Adobe Arabic" w:hAnsi="Adobe Arabic" w:cs="Adobe Arabic"/>
+          <w:sz w:val="36"/>
+          <w:szCs w:val="36"/>
+        </w:rPr>
+      </w:pPr>
+      <w:r>
+        <w:rPr>
+          <w:rFonts w:ascii="Adobe Arabic" w:hAnsi="Adobe Arabic" w:cs="Adobe Arabic"/>
+          <w:sz w:val="36"/>
+          <w:szCs w:val="36"/>
+        </w:rPr>
+        <w:t>Mantendo:</w:t>
+      </w:r>
+    </w:p>
+    <w:p>
+      <w:r>
+        <w:t xml:space="preserve">• </w:t>
+      </w:r>
+      <w:proofErr w:type="spellStart"/>
+      <w:r>
+        <w:t>clocks</w:t>
+      </w:r>
+      <w:proofErr w:type="spellEnd"/>
+      <w:r>
+        <w:t xml:space="preserve"> altos</w:t>
+      </w:r>
+    </w:p>
+    <w:p>
+      <w:r>
+        <w:t>• desempenho competitivo</w:t>
+      </w:r>
+    </w:p>
+    <w:p/>
+    <w:p>
+      <w:pPr>
+        <w:rPr>
+          <w:rFonts w:ascii="Adobe Hebrew" w:hAnsi="Adobe Hebrew" w:cs="Adobe Hebrew"/>
+        </w:rPr>
+      </w:pPr>
+      <w:r>
+        <w:rPr>
+          <w:rFonts w:ascii="Adobe Hebrew" w:hAnsi="Adobe Hebrew" w:cs="Adobe Hebrew"/>
+        </w:rPr>
+        <w:t>CONFIGURAÇÃO DO WINDOWS</w:t>
+      </w:r>
+    </w:p>
+    <w:p>
+      <w:pPr>
+        <w:rPr>
+          <w:rFonts w:ascii="Adobe Arabic" w:hAnsi="Adobe Arabic" w:cs="Adobe Arabic"/>
+          <w:sz w:val="36"/>
+          <w:szCs w:val="36"/>
+        </w:rPr>
+      </w:pPr>
+      <w:r>
+        <w:rPr>
+          <w:rFonts w:ascii="Adobe Arabic" w:hAnsi="Adobe Arabic" w:cs="Adobe Arabic"/>
+          <w:sz w:val="36"/>
+          <w:szCs w:val="36"/>
+        </w:rPr>
+        <w:t>Sistema recomendado:</w:t>
+      </w:r>
+    </w:p>
+    <w:p>
+      <w:r>
+        <w:t>• Windows 10 otimizado</w:t>
+      </w:r>
+    </w:p>
+    <w:p>
+      <w:r>
+        <w:t>• Windows 11 limpo e atualizado</w:t>
+      </w:r>
+    </w:p>
+    <w:p/>
+    <w:p>
+      <w:pPr>
+        <w:rPr>
+          <w:rFonts w:ascii="Adobe Arabic" w:hAnsi="Adobe Arabic" w:cs="Adobe Arabic"/>
+          <w:sz w:val="36"/>
+          <w:szCs w:val="36"/>
+        </w:rPr>
+      </w:pPr>
+      <w:r>
+        <w:rPr>
+          <w:rFonts w:ascii="Adobe Arabic" w:hAnsi="Adobe Arabic" w:cs="Adobe Arabic"/>
+          <w:sz w:val="36"/>
+          <w:szCs w:val="36"/>
+        </w:rPr>
+        <w:t>Plano de energia:</w:t>
+      </w:r>
+    </w:p>
+    <w:p>
+      <w:r>
+        <w:t xml:space="preserve">• AMD </w:t>
+      </w:r>
+      <w:proofErr w:type="spellStart"/>
+      <w:r>
+        <w:t>Ryzen</w:t>
+      </w:r>
+      <w:proofErr w:type="spellEnd"/>
+      <w:r>
+        <w:t xml:space="preserve"> High Performance</w:t>
+      </w:r>
+    </w:p>
+    <w:p>
+      <w:r>
+        <w:t>ou</w:t>
+      </w:r>
+    </w:p>
+    <w:p>
+      <w:r>
+        <w:t>• Alto desempenho</w:t>
+      </w:r>
+    </w:p>
+    <w:p/>
+    <w:p>
+      <w:pPr>
+        <w:rPr>
+          <w:rFonts w:ascii="Adobe Arabic" w:hAnsi="Adobe Arabic" w:cs="Adobe Arabic"/>
+          <w:sz w:val="36"/>
+          <w:szCs w:val="36"/>
+        </w:rPr>
+      </w:pPr>
+      <w:r>
+        <w:rPr>
+          <w:rFonts w:ascii="Adobe Arabic" w:hAnsi="Adobe Arabic" w:cs="Adobe Arabic"/>
+          <w:sz w:val="36"/>
+          <w:szCs w:val="36"/>
+        </w:rPr>
+        <w:t>Desativar:</w:t>
+      </w:r>
+    </w:p>
+    <w:p>
+      <w:r>
+        <w:t>• Xbox Game Bar</w:t>
+      </w:r>
+    </w:p>
+    <w:p>
+      <w:r>
+        <w:t>• Capturas em segundo plano</w:t>
+      </w:r>
+    </w:p>
+    <w:p>
+      <w:r>
+        <w:t>• Widgets</w:t>
+      </w:r>
+    </w:p>
+    <w:p>
+      <w:r>
+        <w:t>• Transparência</w:t>
+      </w:r>
+    </w:p>
+    <w:p>
+      <w:r>
+        <w:t>• Apps em startup</w:t>
+      </w:r>
+    </w:p>
+    <w:p>
+      <w:r>
+        <w:t>• OneDrive automático</w:t>
+      </w:r>
+    </w:p>
+    <w:p>
+      <w:r>
+        <w:lastRenderedPageBreak/>
+        <w:t>• Overlays desnecessários</w:t>
+      </w:r>
+    </w:p>
+    <w:p/>
+    <w:p>
+      <w:pPr>
+        <w:rPr>
+          <w:rFonts w:ascii="Adobe Hebrew" w:hAnsi="Adobe Hebrew" w:cs="Adobe Hebrew"/>
+        </w:rPr>
+      </w:pPr>
+      <w:r>
+        <w:rPr>
+          <w:rFonts w:ascii="Adobe Hebrew" w:hAnsi="Adobe Hebrew" w:cs="Adobe Hebrew"/>
+        </w:rPr>
+        <w:t>CONFIGURAÇÃO DO MOUSE</w:t>
+      </w:r>
+      <w:r>
+        <w:rPr>
+          <w:rFonts w:ascii="Adobe Hebrew" w:hAnsi="Adobe Hebrew" w:cs="Adobe Hebrew"/>
+        </w:rPr>
+        <w:br/>
+      </w:r>
+    </w:p>
+    <w:p>
+      <w:pPr>
+        <w:rPr>
+          <w:rFonts w:ascii="Adobe Arabic" w:hAnsi="Adobe Arabic" w:cs="Adobe Arabic"/>
+          <w:sz w:val="36"/>
+          <w:szCs w:val="36"/>
+        </w:rPr>
+      </w:pPr>
+      <w:r>
+        <w:rPr>
+          <w:rFonts w:ascii="Adobe Arabic" w:hAnsi="Adobe Arabic" w:cs="Adobe Arabic"/>
+          <w:sz w:val="36"/>
+          <w:szCs w:val="36"/>
+        </w:rPr>
+        <w:t>Windows:</w:t>
+      </w:r>
+    </w:p>
+    <w:p>
+      <w:r>
+        <w:t>• desativar “Melhorar precisão do ponteiro”</w:t>
+      </w:r>
+    </w:p>
+    <w:p>
+      <w:pPr>
+        <w:rPr>
+          <w:rFonts w:ascii="Adobe Arabic" w:hAnsi="Adobe Arabic" w:cs="Adobe Arabic"/>
+          <w:sz w:val="36"/>
+          <w:szCs w:val="36"/>
+        </w:rPr>
+      </w:pPr>
+      <w:r>
+        <w:rPr>
+          <w:rFonts w:ascii="Adobe Arabic" w:hAnsi="Adobe Arabic" w:cs="Adobe Arabic"/>
+          <w:sz w:val="36"/>
+          <w:szCs w:val="36"/>
+        </w:rPr>
+        <w:t>Mouse:</w:t>
+      </w:r>
+    </w:p>
+    <w:p>
+      <w:r>
+        <w:t>• DPI 800 ou 1600</w:t>
+      </w:r>
+    </w:p>
+    <w:p>
+      <w:r>
+        <w:t xml:space="preserve">• </w:t>
+      </w:r>
+      <w:proofErr w:type="spellStart"/>
+      <w:r>
+        <w:t>Polling</w:t>
+      </w:r>
+      <w:proofErr w:type="spellEnd"/>
+      <w:r>
+        <w:t xml:space="preserve"> Rate 1000 Hz</w:t>
+      </w:r>
+    </w:p>
+    <w:p/>
+    <w:p>
+      <w:pPr>
+        <w:rPr>
+          <w:rFonts w:ascii="Adobe Hebrew" w:hAnsi="Adobe Hebrew" w:cs="Adobe Hebrew"/>
+        </w:rPr>
+      </w:pPr>
+      <w:r>
+        <w:rPr>
+          <w:rFonts w:ascii="Adobe Hebrew" w:hAnsi="Adobe Hebrew" w:cs="Adobe Hebrew"/>
+        </w:rPr>
+        <w:t>CONFIGURAÇÃO DA AMD RX 7600 (ADRENALIN)</w:t>
+      </w:r>
+    </w:p>
+    <w:p>
+      <w:pPr>
+        <w:rPr>
+          <w:rFonts w:ascii="Adobe Arabic" w:hAnsi="Adobe Arabic" w:cs="Adobe Arabic"/>
+          <w:sz w:val="36"/>
+          <w:szCs w:val="36"/>
+        </w:rPr>
+      </w:pPr>
+      <w:r>
+        <w:rPr>
+          <w:rFonts w:ascii="Adobe Arabic" w:hAnsi="Adobe Arabic" w:cs="Adobe Arabic"/>
+          <w:sz w:val="36"/>
+          <w:szCs w:val="36"/>
+        </w:rPr>
+        <w:t>Ativar:</w:t>
+      </w:r>
+    </w:p>
+    <w:p>
+      <w:r>
+        <w:t xml:space="preserve">• Radeon </w:t>
+      </w:r>
+      <w:proofErr w:type="spellStart"/>
+      <w:r>
+        <w:t>Anti-Lag</w:t>
+      </w:r>
+      <w:proofErr w:type="spellEnd"/>
+    </w:p>
+    <w:p>
+      <w:r>
+        <w:t>• Enhanced Sync</w:t>
+      </w:r>
+    </w:p>
+    <w:p>
+      <w:r>
+        <w:t xml:space="preserve">• Surface Format </w:t>
+      </w:r>
+      <w:proofErr w:type="spellStart"/>
+      <w:r>
+        <w:t>Optimization</w:t>
+      </w:r>
+      <w:proofErr w:type="spellEnd"/>
+    </w:p>
+    <w:p/>
+    <w:p>
+      <w:pPr>
+        <w:rPr>
+          <w:rFonts w:ascii="Adobe Arabic" w:hAnsi="Adobe Arabic" w:cs="Adobe Arabic"/>
+          <w:sz w:val="36"/>
+          <w:szCs w:val="36"/>
+        </w:rPr>
+      </w:pPr>
+      <w:r>
+        <w:rPr>
+          <w:rFonts w:ascii="Adobe Arabic" w:hAnsi="Adobe Arabic" w:cs="Adobe Arabic"/>
+          <w:sz w:val="36"/>
+          <w:szCs w:val="36"/>
+        </w:rPr>
+        <w:t>Desativar:</w:t>
+      </w:r>
+    </w:p>
+    <w:p>
+      <w:r>
+        <w:t xml:space="preserve">• Radeon </w:t>
+      </w:r>
+      <w:proofErr w:type="spellStart"/>
+      <w:r>
+        <w:t>Chill</w:t>
+      </w:r>
+      <w:proofErr w:type="spellEnd"/>
+    </w:p>
+    <w:p>
+      <w:r>
+        <w:t xml:space="preserve">• Radeon </w:t>
+      </w:r>
+      <w:proofErr w:type="spellStart"/>
+      <w:r>
+        <w:t>Boost</w:t>
+      </w:r>
+      <w:proofErr w:type="spellEnd"/>
+    </w:p>
+    <w:p>
+      <w:r>
+        <w:t>• V-Sync</w:t>
+      </w:r>
+    </w:p>
+    <w:p/>
+    <w:p>
+      <w:pPr>
+        <w:rPr>
+          <w:rFonts w:ascii="Adobe Arabic" w:hAnsi="Adobe Arabic" w:cs="Adobe Arabic"/>
+          <w:sz w:val="36"/>
+          <w:szCs w:val="36"/>
+        </w:rPr>
+      </w:pPr>
+      <w:r>
+        <w:rPr>
+          <w:rFonts w:ascii="Adobe Arabic" w:hAnsi="Adobe Arabic" w:cs="Adobe Arabic"/>
+          <w:sz w:val="36"/>
+          <w:szCs w:val="36"/>
+        </w:rPr>
+        <w:t xml:space="preserve">Texture </w:t>
+      </w:r>
+      <w:proofErr w:type="spellStart"/>
+      <w:r>
+        <w:rPr>
+          <w:rFonts w:ascii="Adobe Arabic" w:hAnsi="Adobe Arabic" w:cs="Adobe Arabic"/>
+          <w:sz w:val="36"/>
+          <w:szCs w:val="36"/>
+        </w:rPr>
+        <w:t>Filtering</w:t>
+      </w:r>
+      <w:proofErr w:type="spellEnd"/>
+      <w:r>
+        <w:rPr>
+          <w:rFonts w:ascii="Adobe Arabic" w:hAnsi="Adobe Arabic" w:cs="Adobe Arabic"/>
+          <w:sz w:val="36"/>
+          <w:szCs w:val="36"/>
+        </w:rPr>
+        <w:t xml:space="preserve"> </w:t>
+      </w:r>
+      <w:proofErr w:type="spellStart"/>
+      <w:r>
+        <w:rPr>
+          <w:rFonts w:ascii="Adobe Arabic" w:hAnsi="Adobe Arabic" w:cs="Adobe Arabic"/>
+          <w:sz w:val="36"/>
+          <w:szCs w:val="36"/>
+        </w:rPr>
+        <w:t>Quality</w:t>
+      </w:r>
+      <w:proofErr w:type="spellEnd"/>
+      <w:r>
+        <w:rPr>
+          <w:rFonts w:ascii="Adobe Arabic" w:hAnsi="Adobe Arabic" w:cs="Adobe Arabic"/>
+          <w:sz w:val="36"/>
+          <w:szCs w:val="36"/>
+        </w:rPr>
+        <w:t>:</w:t>
+      </w:r>
+    </w:p>
+    <w:p>
+      <w:r>
+        <w:t>• Performance</w:t>
+      </w:r>
+    </w:p>
+    <w:p>
+      <w:pPr>
+        <w:rPr>
+          <w:rFonts w:ascii="Adobe Arabic" w:hAnsi="Adobe Arabic" w:cs="Adobe Arabic"/>
+          <w:sz w:val="36"/>
+          <w:szCs w:val="36"/>
+        </w:rPr>
+      </w:pPr>
+      <w:proofErr w:type="spellStart"/>
+      <w:r>
+        <w:rPr>
+          <w:rFonts w:ascii="Adobe Arabic" w:hAnsi="Adobe Arabic" w:cs="Adobe Arabic"/>
+          <w:sz w:val="36"/>
+          <w:szCs w:val="36"/>
+        </w:rPr>
+        <w:t>Shader</w:t>
+      </w:r>
+      <w:proofErr w:type="spellEnd"/>
+      <w:r>
+        <w:rPr>
+          <w:rFonts w:ascii="Adobe Arabic" w:hAnsi="Adobe Arabic" w:cs="Adobe Arabic"/>
+          <w:sz w:val="36"/>
+          <w:szCs w:val="36"/>
+        </w:rPr>
+        <w:t xml:space="preserve"> Cache:</w:t>
+      </w:r>
+    </w:p>
+    <w:p>
+      <w:r>
+        <w:t xml:space="preserve">• AMD </w:t>
+      </w:r>
+      <w:proofErr w:type="spellStart"/>
+      <w:r>
+        <w:t>Optimized</w:t>
+      </w:r>
+      <w:proofErr w:type="spellEnd"/>
+    </w:p>
+    <w:p/>
+    <w:p>
+      <w:proofErr w:type="spellStart"/>
+      <w:r>
+        <w:t>Tessellation</w:t>
+      </w:r>
+      <w:proofErr w:type="spellEnd"/>
+      <w:r>
+        <w:t>:</w:t>
+      </w:r>
+    </w:p>
+    <w:p>
+      <w:r>
+        <w:lastRenderedPageBreak/>
+        <w:t xml:space="preserve">• </w:t>
+      </w:r>
+      <w:proofErr w:type="spellStart"/>
+      <w:r>
+        <w:t>Override</w:t>
+      </w:r>
+      <w:proofErr w:type="spellEnd"/>
+      <w:r>
+        <w:t xml:space="preserve"> </w:t>
+      </w:r>
+      <w:proofErr w:type="spellStart"/>
+      <w:r>
+        <w:t>application</w:t>
+      </w:r>
+      <w:proofErr w:type="spellEnd"/>
+      <w:r>
+        <w:t xml:space="preserve"> settings</w:t>
+      </w:r>
+    </w:p>
+    <w:p>
+      <w:r>
+        <w:t>• 8x</w:t>
+      </w:r>
+    </w:p>
+    <w:p/>
+    <w:p>
+      <w:pPr>
+        <w:rPr>
+          <w:rFonts w:ascii="Adobe Hebrew" w:hAnsi="Adobe Hebrew" w:cs="Adobe Hebrew"/>
+        </w:rPr>
+      </w:pPr>
+      <w:r>
+        <w:rPr>
+          <w:rFonts w:ascii="Adobe Hebrew" w:hAnsi="Adobe Hebrew" w:cs="Adobe Hebrew"/>
+        </w:rPr>
+        <w:t>CONFIGURAÇÃO COMPETITIVA DOS JOGOS</w:t>
+      </w:r>
+    </w:p>
+    <w:p>
+      <w:pPr>
+        <w:rPr>
+          <w:rFonts w:ascii="Adobe Arabic" w:hAnsi="Adobe Arabic" w:cs="Adobe Arabic"/>
+          <w:sz w:val="36"/>
+          <w:szCs w:val="36"/>
+        </w:rPr>
+      </w:pPr>
+      <w:r>
+        <w:rPr>
+          <w:rFonts w:ascii="Adobe Arabic" w:hAnsi="Adobe Arabic" w:cs="Adobe Arabic"/>
+          <w:sz w:val="36"/>
+          <w:szCs w:val="36"/>
+        </w:rPr>
+        <w:t>Usar:</w:t>
+      </w:r>
+    </w:p>
+    <w:p>
+      <w:r>
+        <w:t xml:space="preserve">• </w:t>
+      </w:r>
+      <w:proofErr w:type="spellStart"/>
+      <w:r>
+        <w:t>Fullscreen</w:t>
+      </w:r>
+      <w:proofErr w:type="spellEnd"/>
+      <w:r>
+        <w:t xml:space="preserve"> exclusivo</w:t>
+      </w:r>
+    </w:p>
+    <w:p/>
+    <w:p>
+      <w:pPr>
+        <w:rPr>
+          <w:rFonts w:ascii="Adobe Arabic" w:hAnsi="Adobe Arabic" w:cs="Adobe Arabic"/>
+          <w:sz w:val="36"/>
+          <w:szCs w:val="36"/>
+        </w:rPr>
+      </w:pPr>
+      <w:r>
+        <w:rPr>
+          <w:rFonts w:ascii="Adobe Arabic" w:hAnsi="Adobe Arabic" w:cs="Adobe Arabic"/>
+          <w:sz w:val="36"/>
+          <w:szCs w:val="36"/>
+        </w:rPr>
+        <w:t>Desativar:</w:t>
+      </w:r>
+    </w:p>
+    <w:p>
+      <w:r>
+        <w:t>• Motion Blur</w:t>
+      </w:r>
+    </w:p>
+    <w:p>
+      <w:r>
+        <w:t xml:space="preserve">• Ambient </w:t>
+      </w:r>
+      <w:proofErr w:type="spellStart"/>
+      <w:r>
+        <w:t>Occlusion</w:t>
+      </w:r>
+      <w:proofErr w:type="spellEnd"/>
+    </w:p>
+    <w:p>
+      <w:r>
+        <w:t>• Pós-processamento pesado</w:t>
+      </w:r>
+    </w:p>
+    <w:p>
+      <w:r>
+        <w:t>• Sombras altas</w:t>
+      </w:r>
+    </w:p>
+    <w:p>
+      <w:r>
+        <w:t>• Volumétricos altos</w:t>
+      </w:r>
+    </w:p>
+    <w:p/>
+    <w:p>
+      <w:pPr>
+        <w:rPr>
+          <w:rFonts w:ascii="Adobe Arabic" w:hAnsi="Adobe Arabic" w:cs="Adobe Arabic"/>
+          <w:sz w:val="36"/>
+          <w:szCs w:val="36"/>
+        </w:rPr>
+      </w:pPr>
+      <w:r>
+        <w:rPr>
+          <w:rFonts w:ascii="Adobe Arabic" w:hAnsi="Adobe Arabic" w:cs="Adobe Arabic"/>
+          <w:sz w:val="36"/>
+          <w:szCs w:val="36"/>
+        </w:rPr>
+        <w:t>Deixar:</w:t>
+      </w:r>
+    </w:p>
+    <w:p>
+      <w:r>
+        <w:t>• Texturas médias/altas</w:t>
+      </w:r>
+    </w:p>
+    <w:p>
+      <w:r>
+        <w:t xml:space="preserve">• Sombras </w:t>
+      </w:r>
+      <w:proofErr w:type="spellStart"/>
+      <w:r>
+        <w:t>low</w:t>
+      </w:r>
+      <w:proofErr w:type="spellEnd"/>
+    </w:p>
+    <w:p>
+      <w:r>
+        <w:t xml:space="preserve">• efeitos </w:t>
+      </w:r>
+      <w:proofErr w:type="spellStart"/>
+      <w:r>
+        <w:t>low</w:t>
+      </w:r>
+      <w:proofErr w:type="spellEnd"/>
+    </w:p>
+    <w:p/>
+    <w:p>
+      <w:pPr>
+        <w:rPr>
+          <w:rFonts w:ascii="Adobe Arabic" w:hAnsi="Adobe Arabic" w:cs="Adobe Arabic"/>
+          <w:sz w:val="36"/>
+          <w:szCs w:val="36"/>
+        </w:rPr>
+      </w:pPr>
+      <w:r>
+        <w:rPr>
+          <w:rFonts w:ascii="Adobe Arabic" w:hAnsi="Adobe Arabic" w:cs="Adobe Arabic"/>
+          <w:sz w:val="36"/>
+          <w:szCs w:val="36"/>
+        </w:rPr>
+        <w:t>FPS:</w:t>
+      </w:r>
+    </w:p>
+    <w:p>
+      <w:r>
+        <w:t xml:space="preserve">• limitar um pouco acima do </w:t>
+      </w:r>
+      <w:proofErr w:type="spellStart"/>
+      <w:r>
+        <w:t>refresh</w:t>
+      </w:r>
+      <w:proofErr w:type="spellEnd"/>
+      <w:r>
+        <w:t xml:space="preserve"> do monitor</w:t>
+      </w:r>
+    </w:p>
+    <w:p/>
+    <w:p>
+      <w:pPr>
+        <w:rPr>
+          <w:rFonts w:ascii="Adobe Arabic" w:hAnsi="Adobe Arabic" w:cs="Adobe Arabic"/>
+          <w:sz w:val="36"/>
+          <w:szCs w:val="36"/>
+        </w:rPr>
+      </w:pPr>
+      <w:r>
+        <w:rPr>
+          <w:rFonts w:ascii="Adobe Arabic" w:hAnsi="Adobe Arabic" w:cs="Adobe Arabic"/>
+          <w:sz w:val="36"/>
+          <w:szCs w:val="36"/>
+        </w:rPr>
+        <w:t>Exemplo:</w:t>
+      </w:r>
+    </w:p>
+    <w:p>
+      <w:r>
+        <w:t>• monitor 144 Hz → limitar em 160–200 FPS</w:t>
+      </w:r>
+    </w:p>
+    <w:p>
+      <w:r>
+        <w:br/>
+      </w:r>
+    </w:p>
+    <w:p>
+      <w:pPr>
+        <w:rPr>
+          <w:rFonts w:ascii="Adobe Hebrew" w:hAnsi="Adobe Hebrew" w:cs="Adobe Hebrew"/>
+        </w:rPr>
+      </w:pPr>
+      <w:r>
+        <w:rPr>
+          <w:rFonts w:ascii="Adobe Hebrew" w:hAnsi="Adobe Hebrew" w:cs="Adobe Hebrew"/>
+        </w:rPr>
+        <w:t>CONFIGURAÇÃO DE REDE</w:t>
+      </w:r>
+    </w:p>
+    <w:p>
+      <w:pPr>
+        <w:rPr>
+          <w:rFonts w:ascii="Adobe Arabic" w:hAnsi="Adobe Arabic" w:cs="Adobe Arabic"/>
+          <w:sz w:val="36"/>
+          <w:szCs w:val="36"/>
+        </w:rPr>
+      </w:pPr>
+      <w:r>
+        <w:rPr>
+          <w:rFonts w:ascii="Adobe Arabic" w:hAnsi="Adobe Arabic" w:cs="Adobe Arabic"/>
+          <w:sz w:val="36"/>
+          <w:szCs w:val="36"/>
+        </w:rPr>
+        <w:lastRenderedPageBreak/>
+        <w:t>Desativar no adaptador:</w:t>
+      </w:r>
+    </w:p>
+    <w:p>
+      <w:r>
+        <w:t xml:space="preserve">• Energy </w:t>
+      </w:r>
+      <w:proofErr w:type="spellStart"/>
+      <w:r>
+        <w:t>Efficient</w:t>
+      </w:r>
+      <w:proofErr w:type="spellEnd"/>
+      <w:r>
+        <w:t xml:space="preserve"> Ethernet</w:t>
+      </w:r>
+    </w:p>
+    <w:p>
+      <w:r>
+        <w:t>• Green Ethernet</w:t>
+      </w:r>
+    </w:p>
+    <w:p/>
+    <w:p>
+      <w:pPr>
+        <w:rPr>
+          <w:rFonts w:ascii="Adobe Arabic" w:hAnsi="Adobe Arabic" w:cs="Adobe Arabic"/>
+          <w:sz w:val="36"/>
+          <w:szCs w:val="36"/>
+        </w:rPr>
+      </w:pPr>
+      <w:r>
+        <w:rPr>
+          <w:rFonts w:ascii="Adobe Arabic" w:hAnsi="Adobe Arabic" w:cs="Adobe Arabic"/>
+          <w:sz w:val="36"/>
+          <w:szCs w:val="36"/>
+        </w:rPr>
+        <w:t>DNS:</w:t>
+      </w:r>
+    </w:p>
+    <w:p>
+      <w:r>
+        <w:t>• 1.1.1.1</w:t>
+      </w:r>
+    </w:p>
+    <w:p>
+      <w:r>
+        <w:t>• 1.0.0.1</w:t>
+      </w:r>
+    </w:p>
+    <w:p/>
+    <w:p>
+      <w:pPr>
+        <w:rPr>
+          <w:rFonts w:ascii="Adobe Hebrew" w:hAnsi="Adobe Hebrew" w:cs="Adobe Hebrew"/>
+        </w:rPr>
+      </w:pPr>
+      <w:r>
+        <w:rPr>
+          <w:rFonts w:ascii="Adobe Hebrew" w:hAnsi="Adobe Hebrew" w:cs="Adobe Hebrew"/>
+        </w:rPr>
+        <w:t>TEMPERATURAS ESPERADAS</w:t>
+      </w:r>
+    </w:p>
+    <w:p>
+      <w:pPr>
+        <w:rPr>
+          <w:rFonts w:ascii="Adobe Arabic" w:hAnsi="Adobe Arabic" w:cs="Adobe Arabic"/>
+          <w:sz w:val="36"/>
+          <w:szCs w:val="36"/>
+        </w:rPr>
+      </w:pPr>
+      <w:r>
+        <w:rPr>
+          <w:rFonts w:ascii="Adobe Arabic" w:hAnsi="Adobe Arabic" w:cs="Adobe Arabic"/>
+          <w:sz w:val="36"/>
+          <w:szCs w:val="36"/>
+        </w:rPr>
+        <w:t>CPU:</w:t>
+      </w:r>
+    </w:p>
+    <w:p>
+      <w:r>
+        <w:t xml:space="preserve">• </w:t>
+      </w:r>
+      <w:proofErr w:type="spellStart"/>
+      <w:r>
+        <w:t>Idle</w:t>
+      </w:r>
+      <w:proofErr w:type="spellEnd"/>
+      <w:r>
+        <w:t xml:space="preserve"> → 40–50°C</w:t>
+      </w:r>
+    </w:p>
+    <w:p>
+      <w:r>
+        <w:t>• Jogos → 70–88°C</w:t>
+      </w:r>
+      <w:r>
+        <w:br/>
+      </w:r>
+    </w:p>
+    <w:p>
+      <w:r>
+        <w:t xml:space="preserve">Tudo dentro do normal para </w:t>
+      </w:r>
+      <w:proofErr w:type="spellStart"/>
+      <w:r>
+        <w:t>Ryzen</w:t>
+      </w:r>
+      <w:proofErr w:type="spellEnd"/>
+      <w:r>
+        <w:t xml:space="preserve"> 7000.</w:t>
+      </w:r>
+    </w:p>
+    <w:p/>
+    <w:p>
+      <w:pPr>
+        <w:rPr>
+          <w:rFonts w:ascii="Adobe Hebrew" w:hAnsi="Adobe Hebrew" w:cs="Adobe Hebrew"/>
+        </w:rPr>
+      </w:pPr>
+      <w:r>
+        <w:rPr>
+          <w:rFonts w:ascii="Adobe Hebrew" w:hAnsi="Adobe Hebrew" w:cs="Adobe Hebrew"/>
+        </w:rPr>
+        <w:t>DESEMPENHO ESPERADO</w:t>
+      </w:r>
+    </w:p>
+    <w:p>
+      <w:pPr>
+        <w:rPr>
+          <w:rFonts w:ascii="Adobe Arabic" w:hAnsi="Adobe Arabic" w:cs="Adobe Arabic"/>
+          <w:sz w:val="36"/>
+          <w:szCs w:val="36"/>
+        </w:rPr>
+      </w:pPr>
+      <w:proofErr w:type="spellStart"/>
+      <w:r>
+        <w:rPr>
+          <w:rFonts w:ascii="Adobe Arabic" w:hAnsi="Adobe Arabic" w:cs="Adobe Arabic"/>
+          <w:sz w:val="36"/>
+          <w:szCs w:val="36"/>
+        </w:rPr>
+        <w:t>Valorant</w:t>
+      </w:r>
+      <w:proofErr w:type="spellEnd"/>
+      <w:r>
+        <w:rPr>
+          <w:rFonts w:ascii="Adobe Arabic" w:hAnsi="Adobe Arabic" w:cs="Adobe Arabic"/>
+          <w:sz w:val="36"/>
+          <w:szCs w:val="36"/>
+        </w:rPr>
+        <w:t>:</w:t>
+      </w:r>
+    </w:p>
+    <w:p>
+      <w:r>
+        <w:t>• 350–500 FPS</w:t>
+      </w:r>
+    </w:p>
+    <w:p>
+      <w:pPr>
+        <w:rPr>
+          <w:rFonts w:ascii="Adobe Arabic" w:hAnsi="Adobe Arabic" w:cs="Adobe Arabic"/>
+          <w:sz w:val="36"/>
+          <w:szCs w:val="36"/>
+        </w:rPr>
+      </w:pPr>
+      <w:r>
+        <w:rPr>
+          <w:rFonts w:ascii="Adobe Arabic" w:hAnsi="Adobe Arabic" w:cs="Adobe Arabic"/>
+          <w:sz w:val="36"/>
+          <w:szCs w:val="36"/>
+        </w:rPr>
+        <w:t>CS2:</w:t>
+      </w:r>
+    </w:p>
+    <w:p>
+      <w:r>
+        <w:t>• 220–350 FPS</w:t>
+      </w:r>
+    </w:p>
+    <w:p>
+      <w:pPr>
+        <w:rPr>
+          <w:rFonts w:ascii="Adobe Arabic" w:hAnsi="Adobe Arabic" w:cs="Adobe Arabic"/>
+          <w:sz w:val="36"/>
+          <w:szCs w:val="36"/>
+        </w:rPr>
+      </w:pPr>
+      <w:proofErr w:type="spellStart"/>
+      <w:r>
+        <w:rPr>
+          <w:rFonts w:ascii="Adobe Arabic" w:hAnsi="Adobe Arabic" w:cs="Adobe Arabic"/>
+          <w:sz w:val="36"/>
+          <w:szCs w:val="36"/>
+        </w:rPr>
+        <w:t>Fortnite</w:t>
+      </w:r>
+      <w:proofErr w:type="spellEnd"/>
+      <w:r>
+        <w:rPr>
+          <w:rFonts w:ascii="Adobe Arabic" w:hAnsi="Adobe Arabic" w:cs="Adobe Arabic"/>
+          <w:sz w:val="36"/>
+          <w:szCs w:val="36"/>
+        </w:rPr>
+        <w:t xml:space="preserve"> competitivo:</w:t>
+      </w:r>
+    </w:p>
+    <w:p>
+      <w:r>
+        <w:t>• 180–260 FPS</w:t>
+      </w:r>
+    </w:p>
+    <w:p>
+      <w:pPr>
+        <w:rPr>
+          <w:rFonts w:ascii="Adobe Arabic" w:hAnsi="Adobe Arabic" w:cs="Adobe Arabic"/>
+          <w:sz w:val="36"/>
+          <w:szCs w:val="36"/>
+        </w:rPr>
+      </w:pPr>
+      <w:r>
+        <w:rPr>
+          <w:rFonts w:ascii="Adobe Arabic" w:hAnsi="Adobe Arabic" w:cs="Adobe Arabic"/>
+          <w:sz w:val="36"/>
+          <w:szCs w:val="36"/>
+        </w:rPr>
+        <w:t xml:space="preserve">Rainbow Six </w:t>
+      </w:r>
+      <w:proofErr w:type="spellStart"/>
+      <w:r>
+        <w:rPr>
+          <w:rFonts w:ascii="Adobe Arabic" w:hAnsi="Adobe Arabic" w:cs="Adobe Arabic"/>
+          <w:sz w:val="36"/>
+          <w:szCs w:val="36"/>
+        </w:rPr>
+        <w:t>Siege</w:t>
+      </w:r>
+      <w:proofErr w:type="spellEnd"/>
+      <w:r>
+        <w:rPr>
+          <w:rFonts w:ascii="Adobe Arabic" w:hAnsi="Adobe Arabic" w:cs="Adobe Arabic"/>
+          <w:sz w:val="36"/>
+          <w:szCs w:val="36"/>
+        </w:rPr>
+        <w:t>:</w:t>
+      </w:r>
+    </w:p>
+    <w:p>
+      <w:r>
+        <w:t>• 250+ FPS</w:t>
+      </w:r>
+    </w:p>
+    <w:p/>
+    <w:p>
+      <w:pPr>
+        <w:rPr>
+          <w:rFonts w:ascii="Adobe Hebrew" w:hAnsi="Adobe Hebrew" w:cs="Adobe Hebrew"/>
+          <w:sz w:val="30"/>
+          <w:szCs w:val="30"/>
+        </w:rPr>
+      </w:pPr>
+      <w:r>
+        <w:rPr>
+          <w:rFonts w:ascii="Adobe Hebrew" w:hAnsi="Adobe Hebrew" w:cs="Adobe Hebrew"/>
+          <w:sz w:val="30"/>
+          <w:szCs w:val="30"/>
+        </w:rPr>
+        <w:t xml:space="preserve"> - </w:t>
+      </w:r>
+      <w:r>
+        <w:rPr>
+          <w:rFonts w:ascii="Adobe Hebrew" w:hAnsi="Adobe Hebrew" w:cs="Adobe Hebrew"/>
+          <w:sz w:val="30"/>
+          <w:szCs w:val="30"/>
+        </w:rPr>
+        <w:t>CONCLUSÃO</w:t>
+      </w:r>
+      <w:r>
+        <w:rPr>
+          <w:rFonts w:ascii="Adobe Hebrew" w:hAnsi="Adobe Hebrew" w:cs="Adobe Hebrew"/>
+          <w:sz w:val="30"/>
+          <w:szCs w:val="30"/>
+        </w:rPr>
+        <w:t xml:space="preserve"> -</w:t>
+      </w:r>
+    </w:p>
+    <w:p/>
+    <w:p>
+      <w:pPr>
+        <w:rPr>
+          <w:rFonts w:ascii="Adobe Arabic" w:hAnsi="Adobe Arabic" w:cs="Adobe Arabic"/>
+          <w:sz w:val="36"/>
+          <w:szCs w:val="36"/>
+        </w:rPr>
+      </w:pPr>
+      <w:r>
+        <w:rPr>
+          <w:rFonts w:ascii="Adobe Arabic" w:hAnsi="Adobe Arabic" w:cs="Adobe Arabic"/>
+          <w:sz w:val="36"/>
+          <w:szCs w:val="36"/>
+        </w:rPr>
+        <w:t>O computador está:</w:t>
+      </w:r>
+    </w:p>
+    <w:p>
+      <w:r>
+        <w:t>• muito equilibrado</w:t>
+      </w:r>
+    </w:p>
+    <w:p>
+      <w:r>
+        <w:t>• moderno</w:t>
+      </w:r>
+    </w:p>
+    <w:p>
+      <w:r>
+        <w:t>• sem gargalos relevantes</w:t>
+      </w:r>
+    </w:p>
+    <w:p>
+      <w:r>
+        <w:t>• excelente para competitivo</w:t>
+      </w:r>
+    </w:p>
+    <w:p>
+      <w:r>
+        <w:t xml:space="preserve">• ótimo para 1080p high </w:t>
+      </w:r>
+      <w:proofErr w:type="spellStart"/>
+      <w:r>
+        <w:t>refresh</w:t>
+      </w:r>
+      <w:proofErr w:type="spellEnd"/>
+    </w:p>
+    <w:p/>
+    <w:p>
+      <w:pPr>
+        <w:rPr>
+          <w:rFonts w:ascii="Adobe Arabic" w:hAnsi="Adobe Arabic" w:cs="Adobe Arabic"/>
+          <w:sz w:val="36"/>
+          <w:szCs w:val="36"/>
+        </w:rPr>
+      </w:pPr>
+      <w:r>
+        <w:rPr>
+          <w:rFonts w:ascii="Adobe Arabic" w:hAnsi="Adobe Arabic" w:cs="Adobe Arabic"/>
+          <w:sz w:val="36"/>
+          <w:szCs w:val="36"/>
+        </w:rPr>
+        <w:t xml:space="preserve">A combinação </w:t>
+      </w:r>
+      <w:proofErr w:type="spellStart"/>
+      <w:r>
+        <w:rPr>
+          <w:rFonts w:ascii="Adobe Arabic" w:hAnsi="Adobe Arabic" w:cs="Adobe Arabic"/>
+          <w:sz w:val="36"/>
+          <w:szCs w:val="36"/>
+        </w:rPr>
+        <w:t>Ryzen</w:t>
+      </w:r>
+      <w:proofErr w:type="spellEnd"/>
+      <w:r>
+        <w:rPr>
+          <w:rFonts w:ascii="Adobe Arabic" w:hAnsi="Adobe Arabic" w:cs="Adobe Arabic"/>
+          <w:sz w:val="36"/>
+          <w:szCs w:val="36"/>
+        </w:rPr>
+        <w:t xml:space="preserve"> 7600 + RX 7600 + DDR5 6000 + monitor 144 Hz entrega:</w:t>
+      </w:r>
+    </w:p>
+    <w:p>
+      <w:r>
+        <w:t>• baixa latência</w:t>
+      </w:r>
+    </w:p>
+    <w:p>
+      <w:r>
+        <w:t>• excelente responsividade</w:t>
+      </w:r>
+    </w:p>
+    <w:p>
+      <w:r>
+        <w:t xml:space="preserve">• </w:t>
+      </w:r>
+      <w:proofErr w:type="spellStart"/>
+      <w:r>
+        <w:t>frametime</w:t>
+      </w:r>
+      <w:proofErr w:type="spellEnd"/>
+      <w:r>
+        <w:t xml:space="preserve"> estável</w:t>
+      </w:r>
+    </w:p>
+    <w:p>
+      <w:r>
+        <w:t>• ótima longevidade</w:t>
+      </w:r>
+    </w:p>
+    <w:p>
+      <w:r>
+        <w:t>• experiência competitiva muito forte.</w:t>
+      </w:r>
+      <w:r>
+        <w:br/>
+      </w:r>
+      <w:r>
+        <w:br/>
+      </w:r>
+      <w:r>
+        <w:br/>
+      </w:r>
+      <w:r>
+        <w:br/>
+      </w:r>
+      <w:r>
+        <w:br/>
+      </w:r>
+      <w:r>
+        <w:br/>
+      </w:r>
+      <w:r>
+        <w:br/>
+      </w:r>
+      <w:r>
+        <w:br/>
+      </w:r>
+      <w:r>
+        <w:br/>
+      </w:r>
+      <w:r>
+        <w:br/>
+      </w:r>
+      <w:r>
+        <w:br/>
+      </w:r>
+      <w:r>
+        <w:br/>
+      </w:r>
+      <w:r>
+        <w:br/>
+      </w:r>
+      <w:r>
+        <w:br/>
+      </w:r>
+      <w:r>
+        <w:br/>
+      </w:r>
+      <w:r>
+        <w:br/>
+      </w:r>
+      <w:r>
+        <w:br/>
+      </w:r>
+      <w:r>
+        <w:br/>
+      </w:r>
+      <w:r>
+        <w:rPr>
+          <w:rFonts w:ascii="Adobe Hebrew" w:hAnsi="Adobe Hebrew" w:cs="Adobe Hebrew"/>
+          <w:sz w:val="40"/>
+          <w:szCs w:val="40"/>
+        </w:rPr>
+        <w:t xml:space="preserve">  </w:t>
+      </w:r>
+      <w:r>
+        <w:rPr>
+          <w:rFonts w:ascii="Adobe Hebrew" w:hAnsi="Adobe Hebrew" w:cs="Adobe Hebrew"/>
+          <w:sz w:val="40"/>
+          <w:szCs w:val="40"/>
+        </w:rPr>
+        <w:t>--QUALIDADE DAS PEÇAS</w:t>
+      </w:r>
+      <w:r>
+        <w:rPr>
+          <w:rFonts w:ascii="Adobe Hebrew" w:hAnsi="Adobe Hebrew" w:cs="Adobe Hebrew"/>
+          <w:sz w:val="40"/>
+          <w:szCs w:val="40"/>
+        </w:rPr>
+        <w:t>--</w:t>
+      </w:r>
+      <w:r>
+        <w:br/>
+      </w:r>
+      <w:r>
+        <w:lastRenderedPageBreak/>
+        <w:br/>
+      </w:r>
+      <w:proofErr w:type="spellStart"/>
+      <w:r>
+        <w:t>Ryzen</w:t>
+      </w:r>
+      <w:proofErr w:type="spellEnd"/>
+      <w:r>
+        <w:t xml:space="preserve"> 5 - Extremamente forte ao rodar este jogo e diversos outros, é um processador moderno que consegue executar multitarefas, tendo um bom custo benef</w:t>
+      </w:r>
+      <w:r>
+        <w:t>í</w:t>
+      </w:r>
+      <w:r>
+        <w:t>cio.</w:t>
+      </w:r>
+    </w:p>
+    <w:p>
+      <w:r>
+        <w:t>Mem</w:t>
+      </w:r>
+      <w:r>
+        <w:t>ó</w:t>
+      </w:r>
+      <w:r>
+        <w:t xml:space="preserve">ria </w:t>
+      </w:r>
+      <w:proofErr w:type="spellStart"/>
+      <w:r>
+        <w:t>ram</w:t>
+      </w:r>
+      <w:proofErr w:type="spellEnd"/>
+      <w:r>
+        <w:t xml:space="preserve"> DDR5 8GB - Possui uma excelente frequ</w:t>
+      </w:r>
+      <w:r>
+        <w:t>ê</w:t>
+      </w:r>
+      <w:r>
+        <w:t xml:space="preserve">ncia para AM5, ajuda a ter FPS estável, e é feita para a </w:t>
+      </w:r>
+      <w:proofErr w:type="spellStart"/>
+      <w:r>
+        <w:t>Ryzen</w:t>
+      </w:r>
+      <w:proofErr w:type="spellEnd"/>
+      <w:r>
+        <w:t>.</w:t>
+      </w:r>
+    </w:p>
+    <w:p>
+      <w:r>
+        <w:t xml:space="preserve">Placa mãe - Suporta </w:t>
+      </w:r>
+      <w:proofErr w:type="spellStart"/>
+      <w:r>
+        <w:t>Ryzen</w:t>
+      </w:r>
+      <w:proofErr w:type="spellEnd"/>
+      <w:r>
+        <w:t xml:space="preserve"> AM5 DDR5, permite SSD muito rápido. Não </w:t>
+      </w:r>
+      <w:r>
+        <w:t xml:space="preserve">haverá </w:t>
+      </w:r>
+      <w:r>
+        <w:t>nenhum problema com um futuro upgrade, sendo desnecessário a troca da placa mãe.</w:t>
+      </w:r>
+    </w:p>
+    <w:p>
+      <w:r>
+        <w:t>Placa de v</w:t>
+      </w:r>
+      <w:r>
+        <w:t>í</w:t>
+      </w:r>
+      <w:r>
+        <w:t>deo - Ela é muito boa para 1080p. A GPU renderiza os gráficos excelentemente, tem um modelo com resfriamento potente, mais silencioso, ma</w:t>
+      </w:r>
+      <w:r>
+        <w:t>n</w:t>
+      </w:r>
+      <w:r>
+        <w:t>tendo o FPS entre 200-400.</w:t>
+      </w:r>
+    </w:p>
+    <w:p>
+      <w:r>
+        <w:t>Fonte MSI - É uma fonte segura pra esse setup, ela entrega potência suficiente, com menos desperdício de energia.</w:t>
+      </w:r>
+    </w:p>
+    <w:p>
+      <w:r>
+        <w:t xml:space="preserve">6 SSD - Bem mais rápido que HD, muito mais potente que SSD SATA 1TB, cabe no </w:t>
+      </w:r>
+      <w:proofErr w:type="spellStart"/>
+      <w:r>
+        <w:t>windowns</w:t>
+      </w:r>
+      <w:proofErr w:type="spellEnd"/>
+      <w:r>
+        <w:t xml:space="preserve"> CS2 GTA dentre vários outros programas.</w:t>
+      </w:r>
+    </w:p>
+    <w:p>
+      <w:r>
+        <w:t xml:space="preserve">Gabinete - Possui </w:t>
+      </w:r>
+      <w:proofErr w:type="spellStart"/>
+      <w:r>
+        <w:t>mesh</w:t>
+      </w:r>
+      <w:proofErr w:type="spellEnd"/>
+      <w:r>
+        <w:t xml:space="preserve"> frontal, tem frente vazada o que ajuda absurdamente com o resfri</w:t>
+      </w:r>
+      <w:r>
+        <w:t>a</w:t>
+      </w:r>
+      <w:r>
+        <w:t>mento do computador, o deixando mais potente.</w:t>
+      </w:r>
+    </w:p>
+    <w:p>
+      <w:r>
+        <w:t xml:space="preserve">Monitor - É excelente para o modo competitivo 144Hz, muito importante no CS2, com a imagem mais lisa, menos </w:t>
+      </w:r>
+      <w:proofErr w:type="spellStart"/>
+      <w:r>
+        <w:t>ghostings</w:t>
+      </w:r>
+      <w:proofErr w:type="spellEnd"/>
+      <w:r>
+        <w:t>, e com mais movimento suave.</w:t>
+      </w:r>
+    </w:p>
+    <w:p>
+      <w:r>
+        <w:t>Teclado - Suas teclas são de alta qualidade, com um tempo de uso prolongado.</w:t>
+      </w:r>
+    </w:p>
+    <w:p>
+      <w:r>
+        <w:t xml:space="preserve">Mouse - Sua </w:t>
+      </w:r>
+      <w:proofErr w:type="spellStart"/>
+      <w:r>
+        <w:t>dpi</w:t>
+      </w:r>
+      <w:proofErr w:type="spellEnd"/>
+      <w:r>
+        <w:t xml:space="preserve"> é alta, sensor que permite grande precisão, que é essencial para no CS.</w:t>
+      </w:r>
+    </w:p>
+    <w:p>
+      <w:r>
+        <w:t xml:space="preserve">Headset - Possui o </w:t>
+      </w:r>
+      <w:r>
+        <w:t>áu</w:t>
+      </w:r>
+      <w:r>
+        <w:t>dio estéreo de alt</w:t>
+      </w:r>
+      <w:r>
+        <w:t>í</w:t>
+      </w:r>
+      <w:r>
+        <w:t>ssima precisão, permitindo escutar os passos dos inimigos durante a jogatina.</w:t>
+      </w:r>
+    </w:p>
     <w:sectPr>
       <w:pgSz w:w="11906" w:h="16838"/>
       <w:pgMar w:top="1417" w:right="1701" w:bottom="1417" w:left="1701" w:header="708" w:footer="708" w:gutter="0"/>
@@ -2007,10 +3590,10 @@
   <a:themeElements>
     <a:clrScheme name="Office">
       <a:dk1>
-        <a:sysClr val="windowText" lastClr="000000"/>
+        <a:sysClr val="windowText" lastClr="FFFFFF"/>
       </a:dk1>
       <a:lt1>
-        <a:sysClr val="window" lastClr="FFFFFF"/>
+        <a:sysClr val="window" lastClr="2D3236"/>
       </a:lt1>
       <a:dk2>
         <a:srgbClr val="0E2841"/>

</xml_diff>